<commit_message>
apply the final proofread: scope the discussion's claims, fix the design and cochlea descriptions, the order of the statements and the summary's section labels, protect proper nouns in the bibliography, and add the smoke run
</commit_message>
<xml_diff>
--- a/papers/02-untrained-reservoirs/spoken-digit-recognition-without-training.docx
+++ b/papers/02-untrained-reservoirs/spoken-digit-recognition-without-training.docx
@@ -253,7 +253,7 @@
         <w:rPr>
           <w:lang w:val="en-GB"/>
         </w:rPr>
-        <w:t xml:space="preserve">dynamics and structure itself. Our ablation study results give future studies of trained</w:t>
+        <w:t xml:space="preserve">dynamics and structure themselves. Our ablation study results give future studies of trained</w:t>
       </w:r>
       <w:r>
         <w:rPr>
@@ -522,13 +522,7 @@
         <w:rPr>
           <w:lang w:val="en-GB"/>
         </w:rPr>
-        <w:t xml:space="preserve"> </w:t>
-      </w:r>
-      <w:r>
-        <w:rPr>
-          <w:lang w:val="en-GB"/>
-        </w:rPr>
-        <w:t xml:space="preserve">and, on graphs, as Stuart–Landau against Kuramoto without fixing the amplitude</w:t>
+        <w:t xml:space="preserve">; one graph network has since set Stuart–Landau against Kuramoto, without fixing the amplitude</w:t>
       </w:r>
       <w:r>
         <w:rPr>
@@ -1266,19 +1260,19 @@
         <w:rPr>
           <w:lang w:val="en-GB"/>
         </w:rPr>
-        <w:t xml:space="preserve">and coupled oscillatory recurrent networks (coRNN,</w:t>
-      </w:r>
-      <w:r>
-        <w:rPr>
-          <w:lang w:val="en-GB"/>
-        </w:rPr>
-        <w:t xml:space="preserve"> </w:t>
-      </w:r>
-      <w:r>
-        <w:rPr>
-          <w:lang w:val="en-GB"/>
-        </w:rPr>
-        <w:t xml:space="preserve">Rusch &amp; Mishra (</w:t>
+        <w:t xml:space="preserve">and coupled oscillatory recurrent networks, coRNN</w:t>
+      </w:r>
+      <w:r>
+        <w:rPr>
+          <w:lang w:val="en-GB"/>
+        </w:rPr>
+        <w:t xml:space="preserve"> </w:t>
+      </w:r>
+      <w:r>
+        <w:rPr>
+          <w:lang w:val="en-GB"/>
+        </w:rPr>
+        <w:t xml:space="preserve">(</w:t>
       </w:r>
       <w:hyperlink w:anchor="ref-rusch2021">
         <w:r>
@@ -1286,7 +1280,7 @@
             <w:rStyle w:val="Hyperlink"/>
             <w:lang w:val="en-GB"/>
           </w:rPr>
-          <w:t xml:space="preserve">2021</w:t>
+          <w:t xml:space="preserve">Rusch &amp; Mishra, 2021</w:t>
         </w:r>
       </w:hyperlink>
       <w:r>
@@ -1299,7 +1293,7 @@
         <w:rPr>
           <w:lang w:val="en-GB"/>
         </w:rPr>
-        <w:t xml:space="preserve">), one of which reached 89% on AudioMNIST from the raw waveform with a random, not speaker-disjoint, split</w:t>
+        <w:t xml:space="preserve">, one of which reached 89% on AudioMNIST from the raw waveform with a random, not speaker-disjoint, split</w:t>
       </w:r>
       <w:r>
         <w:rPr>
@@ -1427,7 +1421,7 @@
         <w:rPr>
           <w:lang w:val="en-GB"/>
         </w:rPr>
-        <w:t xml:space="preserve">the order of events. It ran as eight experiments with 6,353 single-control ablation experimentation runs in total. Every run is one arm at one noise level, input gain and seed executed three times with a different seed each time. The code and every run’s record, with a README for each experiment and a summary of every result, are in the supplementary material, and</w:t>
+        <w:t xml:space="preserve">the order of events. It ran as eight experiments with 6,353 single-control ablation experimentation runs in total. Every run is one arm at one noise level, input gain and seed, and every condition is run at three seeds. The code and every run’s record, with a README for each experiment and a summary of every result, are in the supplementary material, and</w:t>
       </w:r>
       <w:r>
         <w:rPr>
@@ -2082,7 +2076,7 @@
         <w:rPr>
           <w:lang w:val="en-GB"/>
         </w:rPr>
-        <w:t xml:space="preserve">shows every arm at the primary cell, and the supplementary material gives the tables. The spectrogram-only baseline read 93.6%, 78.0% and 71.6% on clean audio, at 0 dB and at −5 dB, and the Kuramoto network at gain 1 read 91.1%, 77.8% and 70.7%: within a point of its input with noise (−0.23 [−0.99, +0.52] at 0 dB, −0.88 [−1.66, −0.09] at −5 dB) and 2.53 points below it on clean audio, but 7.5 to 15.9 points above the input read over the same frames, from frame 16. It read 0.43 to 1.08 points above the uncoupled network, and about 4 points above the state-matched leaky-integrator bank with noise but 2.35 points below it on clean audio; gain 2 read lower than gain 1 for every control reservoir. The Stuart–Landau network read 93.9%, 80.3% and 73.0% (gain 1), within its input on clean audio (+0.28 [−0.19, +0.77]) and above it in every noisy condition (</w:t>
+        <w:t xml:space="preserve">shows every arm at the primary cell, and the supplementary material gives the tables. The spectrogram-only baseline read 93.6%, 78.0% and 71.6% on clean audio, at 0 dB and at −5 dB, and the Kuramoto network at gain 1 read 91.1%, 77.8% and 70.7%: within a point of its input with noise (−0.23 [−0.99, +0.52] at 0 dB, −0.88 [−1.66, −0.09] at −5 dB) and 2.53 points below it on clean audio, but 7.5 to 15.9 points above the input read over the same frames, from frame 16. It read 0.43 to 1.08 points above the uncoupled network, and about 4 points above the state-matched leaky-integrator bank with noise but 2.35 points below it on clean audio; gain 2 read lower than gain 1 for every control reservoir. The Stuart–Landau network read 93.9%, 80.3% and 73.0% (gain 1), level with its input on clean audio (+0.28 points) and above it in every noisy condition (</w:t>
       </w:r>
       <w:hyperlink w:anchor="sec-4-3">
         <w:r>
@@ -2319,7 +2313,7 @@
         <w:rPr>
           <w:lang w:val="en-GB"/>
         </w:rPr>
-        <w:t xml:space="preserve">The design experiment varied the coupled network one factor at a time around the reference: six coupling functions, six lattice geometries and three kinds of natural frequencies, crossed with two restoring strengths and two coupling ceilings, 312 configurations at 0 and −5 dB, gains 1 and 2 and three seeds, each level paired with its reference over every configuration matching it in the other factors (</w:t>
+        <w:t xml:space="preserve">The design experiment crossed six coupling functions, six lattice geometries, three kinds of natural frequencies, two restoring strengths and two coupling ceilings (the Stuart–Landau functions on the torus only), 312 configurations at 0 and −5 dB, gains 1 and 2 and three seeds, each level paired with its reference over every configuration matching it in the other factors (</w:t>
       </w:r>
       <w:hyperlink w:anchor="fig-c4-coupling-functions">
         <w:r>
@@ -2525,7 +2519,7 @@
         <w:rPr>
           <w:lang w:val="en-GB"/>
         </w:rPr>
-        <w:t xml:space="preserve">, the coil with a one-way base-to-apex coupling and coupling that grows with the coil’s curvature toward the apex, read 0.41 to 0.97 points below the torus. Part of that gap is the cochlea’s weaker coupling: capping its curvature weights at the apex halves its average coupling, and a control at the coil’s average coupling read 0.28 to 0.71 points above the cochlea, yet 0.40 to 0.47 points below the coil at gain 1 and within 0.12 points of it at gain 2.</w:t>
+        <w:t xml:space="preserve">, the coil with coupling three times as strong from base to apex as back and growing with the coil’s curvature toward the apex, read 0.41 to 0.97 points below the torus. Part of that gap is the cochlea’s weaker coupling: capping its curvature weights at the apex halves its average coupling, and a control at the coil’s average coupling read 0.28 to 0.71 points above the cochlea, yet 0.40 to 0.47 points below the coil at gain 1 and within 0.12 points of it at gain 2.</w:t>
       </w:r>
     </w:p>
     <w:bookmarkStart w:id="35" w:name="fig-c4-lattice-geometries"/>
@@ -2773,7 +2767,7 @@
         <w:rPr>
           <w:lang w:val="en-GB"/>
         </w:rPr>
-        <w:t xml:space="preserve">How strongly an oscillator returns to it’s original position, it’s restoring strength, of 0.1 read 0.13 to 0.23 points below 0.3, and a coupling ceiling of 0.5 read 0.39 to 0.68 points below 1. A sweep beyond these levels, for every coupling function at the reference configuration, found restoring strengths of 0.5 to 1.0 moving the phase-oscillator networks by −1.2 to +2.1 points and lowering the Stuart–Landau network in every condition, by 0.4 to 2.8 points, and ceilings of 1.5 and 2 moving every coupling function by −2.4 to +1.7 points. Gain separates the Stuart–Landau network from the rest (</w:t>
+        <w:t xml:space="preserve">A restoring strength (the pull toward phase 0) of 0.1 read 0.13 to 0.23 points below 0.3, and a coupling ceiling of 0.5 read 0.39 to 0.68 points below 1. A sweep beyond these levels, for every coupling function at the reference configuration, found restoring strengths of 0.5 to 1.0 moving the phase-oscillator networks by −1.2 to +2.1 points and lowering the Stuart–Landau network in every condition, by 0.4 to 2.8 points, and ceilings of 1.5 and 2 moving every coupling function by −2.4 to +1.7 points. Gain separates the Stuart–Landau network from the rest (</w:t>
       </w:r>
       <w:hyperlink w:anchor="fig-c6-restoring-ceiling-gain">
         <w:r>
@@ -2788,7 +2782,7 @@
         <w:rPr>
           <w:lang w:val="en-GB"/>
         </w:rPr>
-        <w:t xml:space="preserve">): from gain 1 to gain 8 it lost 4.3 points at 0 dB and 2.8 at −5 dB, while every phase-oscillator network lost 15 to 19 points and the Stuart–Landau network with its amplitude fixed 25 to 28; beyond gain 8 it also gave way, losing 8.4 points by gain 10 and 20.8 by gain 12 at 0 dB. Below gain 1 the order reverses: at gains 0.25 and 0.5 the phase-oscillator networks and the fixed-amplitude network read 0.3 to 2.5 points above gain 1 and the Stuart–Landau network 0.7 to 1.7 points below it. At its better low gain every phase-oscillator network read above its input at 0 dB, by 0.7 to 1.6 points, and the second-harmonic network at −5 dB too, by 1.4, which brings the best of them within 0.7 points of the Stuart–Landau network at gain 1.</w:t>
+        <w:t xml:space="preserve">): from gain 1 to gain 8 it lost 4.3 points at 0 dB and 2.8 at −5 dB, while every phase-oscillator network lost 15 to 19 points and the Stuart–Landau network with its amplitude fixed 25 to 28; beyond gain 8 it also gave way, losing 8.4 points by gain 10 and 20.8 by gain 12 at 0 dB. Below gain 1 the order reverses: at gains 0.25 and 0.5 the phase-oscillator networks and the fixed-amplitude network read 0.3 to 2.5 points above gain 1 and the Stuart–Landau network 0.7 to 1.7 points below it. At its better low gain every phase-oscillator network read above its input at 0 dB, by 0.7 to 1.6 points, and the second-harmonic network at −5 dB too, by 1.4, which brings the best of them within 0.8 points of the Stuart–Landau network at gain 1 at 0 dB and level with it at −5 dB.</w:t>
       </w:r>
     </w:p>
     <w:bookmarkStart w:id="44" w:name="fig-c6-restoring-ceiling-gain"/>
@@ -2896,7 +2890,7 @@
         <w:rPr>
           <w:lang w:val="en-GB"/>
         </w:rPr>
-        <w:t xml:space="preserve">Widening the readout to 1,024 and 4,096 features raised every arm with more than 192 features to read, the Kuramoto network by up to 6.3 points and the leaky-integrator banks by up to 6.2, and left the 192-wide arms unchanged (</w:t>
+        <w:t xml:space="preserve">Widening the readout to 1,024 and 4,096 features raised nearly every arm with more than 192 features to read, the Kuramoto network by up to 3.8 points at gain 1 (6.3 at gain 2) and the leaky-integrator banks by up to 6.2, and left the 192-wide arms unchanged (</w:t>
       </w:r>
       <w:hyperlink w:anchor="fig-c9-readout-width">
         <w:r>
@@ -2938,7 +2932,7 @@
         <w:rPr>
           <w:lang w:val="en-GB"/>
         </w:rPr>
-        <w:t xml:space="preserve">shows the reader structure). From 2,048 to 24,000 training clips, at width 192, the spectrogram-only baseline gained 3.5 to 4.1 points, the Kuramoto network 2.0 and the trained baselines 7.1 to 12.4, since they learn through their networks as well as their readout. At width 4,096 the Kuramoto network read above the whole-clip spectrogram-only baseline at every training size, and with 2,048 clips at 0 dB above the S4D, CNN and transformer (81.4% against 79.2% to 80.8%), though through a readout with more weights than theirs; with 8,192 or 24,000 clips every trained baseline read above every reservoir at every width. Read through the seeded projection instead of the fixed one, the controls experiment’s reservoirs moved by −1.29 to +1.22 points (median −0.06), and every paired comparison between the controls arms kept its sign.</w:t>
+        <w:t xml:space="preserve">shows the reader structure). From 2,048 to 24,000 training clips, at width 192 and with noise, the spectrogram-only baseline gained 3.5 to 4.1 points, the Kuramoto network 2.0 and the trained baselines 7.1 to 12.4, since they learn through their networks as well as their readout. At width 4,096 the Kuramoto network read above the whole-clip spectrogram-only baseline at every training size, and with 2,048 clips at 0 dB above the S4D, CNN and transformer (81.4% against 79.2% to 80.8%), though through a readout with more weights than theirs; with 8,192 or 24,000 clips every trained baseline read above every reservoir at every width with noise. Read through the seeded projection instead of the fixed one, the controls experiment’s reservoirs moved by −1.29 to +1.22 points (median −0.06), and every paired comparison between the controls arms kept its sign.</w:t>
       </w:r>
     </w:p>
     <w:bookmarkStart w:id="50" w:name="fig-c9-readout-width"/>
@@ -3052,7 +3046,7 @@
         <w:rPr>
           <w:lang w:val="en-GB"/>
         </w:rPr>
-        <w:t xml:space="preserve">). Read directly on the spectrogram, the readout reaches 93.6%, 78.0% and 71.6%, and at the common width no untrained reservoir adds more than 2.3 points to that, the most being the Stuart–Landau network’s. The untrained Kuramoto network does not read above its own input. What it adds is memory: read only after its warm-up, it recovers most of what the input loses without its first 16 frames, which hold the onset, and it carries the order of two digits that an order-free read of the input cannot see. A leaky-integrator bank of the same size does both as well or better, and both remember by the same means, integration. A leaky integrator keeps a running average of its band’s energy; a Kuramoto oscillator’s phase advances at its natural frequency plus its drive, so, apart from the restoring pull and the coupling, its phase is the running sum of its band’s energy wrapped around the circle. Because an integrator’s state at each moment depends on what came before it, statistics of that state over the clip differ with the order of its inputs, where the same statistics of the input do not. Oscillation therefore adds no memory the bank lacks; the phase is an integrator whose sum wraps. An analysis of variance per band and time window shows it (</w:t>
+        <w:t xml:space="preserve">). Read directly on the spectrogram, the readout reaches 93.6%, 78.0% and 71.6%, and at the common width no untrained reservoir adds more than 2.3 points to that, the most being the Stuart–Landau network’s. At gains 1 and 2 the untrained Kuramoto network does not read above its own input. What it adds is memory: read only after its warm-up, it recovers most of what the input loses without its first 16 frames, which hold the onset, and it carries the order of two digits that an order-free read of the input cannot see. A leaky-integrator bank of the same size does both, better on order and on clean audio though about 4 points worse with noise, and both remember by the same means, integration. A leaky integrator keeps a running average of its band’s energy; a Kuramoto oscillator’s phase advances at its natural frequency plus its drive, so, apart from the restoring pull and the coupling, its phase is the running sum of its band’s energy wrapped around the circle. Because an integrator’s state at each moment depends on what came before it, statistics of that state over the clip differ with the order of its inputs, where the same statistics of the input do not. Oscillation therefore adds no memory the bank lacks; the phase is an integrator whose sum wraps. An analysis of variance per band and time window shows it (</w:t>
       </w:r>
       <w:hyperlink w:anchor="fig-c7-anova-f">
         <w:r>
@@ -3160,7 +3154,7 @@
         <w:rPr>
           <w:lang w:val="en-GB"/>
         </w:rPr>
-        <w:t xml:space="preserve">; its authors expect a reservoir to help most where a linear classifier on the input falls short, and in our noisy conditions, where it does, Kuramoto matches the input and Stuart–Landau reads 1.1 to 2.3 points above it.</w:t>
+        <w:t xml:space="preserve">; its authors expect a reservoir to help most where a linear classifier on the input falls short, and in our noisy conditions, where it does, Kuramoto reads within a point of the input and Stuart–Landau reads 1.1 to 2.3 points above it.</w:t>
       </w:r>
     </w:p>
     <w:p>
@@ -3218,7 +3212,7 @@
         <w:rPr>
           <w:lang w:val="en-GB"/>
         </w:rPr>
-        <w:t xml:space="preserve">; fixing the amplitude, which that study did not, places the effect in the amplitude. One reading is that a free amplitude lets an oscillator absorb a strong drive in its radius, where a phase oscillator can only be pushed faster. The gain sweep agrees: the phase-oscillator networks read best at the weakest gains, and the Stuart–Landau network at gains 1 and 2. Among phase oscillators the coupling function and the geometry each moved accuracy by less than a point, and a coil and a cochlea, built to follow the cochlea’s shape and mechanics, read no better than the torus.</w:t>
+        <w:t xml:space="preserve">; fixing the amplitude, which that study did not, places the effect in the amplitude. One reading is that a free amplitude lets an oscillator absorb a strong drive in its radius, where a phase oscillator can only be pushed faster. The gain sweep agrees: the phase-oscillator networks read best at the weakest gains, and the Stuart–Landau network near gain 1. Among phase oscillators the coupling function and the geometry each moved accuracy by less than a point, and a coil and a cochlea, built to follow the cochlea’s shape and mechanics, read no better than the torus.</w:t>
       </w:r>
     </w:p>
     <w:p>
@@ -3243,7 +3237,7 @@
         <w:rPr>
           <w:lang w:val="en-GB"/>
         </w:rPr>
-        <w:t xml:space="preserve">More training data raised every arm, the trained baselines three to six times as much as the reservoirs, since in a reservoir only the readout learns. The common width of 192 favours the input: it reads the spectrogram’s 192 features whole, but compresses a reservoir’s 12,288 to 24,576 features by 64 to 128 times through a random projection, which keeps the distances between clips only roughly at so few dimensions</w:t>
+        <w:t xml:space="preserve">With noise, more training data raised every arm, the trained baselines three to six times as much as the Kuramoto network and up to three times as much as the leaky-integrator banks, since in a reservoir only the readout learns. The common width of 192 favours the input: it reads the spectrogram’s 192 features whole, but compresses a reservoir’s 12,288 to 24,576 features by 64 to 128 times through a random projection, which keeps the distances between clips only roughly at so few dimensions</w:t>
       </w:r>
       <w:r>
         <w:rPr>
@@ -3276,7 +3270,7 @@
         <w:rPr>
           <w:lang w:val="en-GB"/>
         </w:rPr>
-        <w:t xml:space="preserve">, so differences between digits that the full features hold can blur. Read at 4,096, the reservoirs pass their input, but their readout then fits 40,970 (4,096 × 10 digits + 10 digit biases) weights against the 1,930 that read the input’s 192 features, about 21 times as many, so some or all of the task accuracy improvement could come from the extra weights rather than the dynamics. The fair comparison is at the common width, where the Kuramoto network reads within a point of its input in noise.</w:t>
+        <w:t xml:space="preserve">, so differences between digits that the full features hold can blur. Read at 4,096, the coupled network and the leaky-integrator banks at gain 1 pass their input, but their readout then fits 40,970 (4,096 × 10 digits + 10 digit biases) weights against the 1,930 that read the input’s 192 features, about 21 times as many, so some or all of the task accuracy improvement could come from the extra weights rather than the dynamics. The fair comparison is at the common width, where the Kuramoto network reads within a point of its input in noise.</w:t>
       </w:r>
     </w:p>
     <w:p>
@@ -3577,7 +3571,7 @@
         <w:rPr>
           <w:lang w:val="en-GB"/>
         </w:rPr>
-        <w:t xml:space="preserve">Untrained and read at a common width, a coupled oscillator network reads about as well as its own input on noisy speaker-disjoint spoken-digit recognition and carries the order of events by integrating its input, as a leaky-integrator bank does; coupling adds to both tasks, a free amplitude lifts the network above its input in noise and a weaker input does so at 0 dB, and the lattice geometry and phase coupling function each move it by less than a point. Small trained networks read higher with noise, the Stuart–Landau network alone reaching their range at gains 1 and 2, and these results are the baseline a trained oscillator network of similar size and task should beat.</w:t>
+        <w:t xml:space="preserve">Untrained and read at a common width, a coupled oscillator network reads about as well as its own input on noisy speaker-disjoint spoken-digit recognition and carries the order of events by integrating its input, as a leaky-integrator bank does; coupling adds to both tasks, a free amplitude lifts the network above its input in noise and a weaker input does so at 0 dB, and the lattice geometry and phase coupling function each move it by less than a point. Small trained networks read higher with noise, the Stuart–Landau network alone reaching their range at gain 1, and these results are the baseline a trained oscillator network of similar size and task should beat.</w:t>
       </w:r>
     </w:p>
     <w:bookmarkEnd w:id="53"/>
@@ -3634,22 +3628,7 @@
         <w:rPr>
           <w:lang w:val="en-GB"/>
         </w:rPr>
-        <w:t xml:space="preserve">. Scripts and a README with instructions on how to reproduce the data and figures are included in the supplementary material. Every run records its code version, hardware and library versions. The leak check and the controls and design experiments ran on the CPU of an Apple M1 Max, where runs with the same seed are bit-identical. The later experiments simulated the reservoirs on its GPU, which reproduced 1,262 of 1,296 of the controls experiment’s cells exactly and all but one within two test clips (</w:t>
-      </w:r>
-      <w:hyperlink w:anchor="sec-3-5">
-        <w:r>
-          <w:rPr>
-            <w:rStyle w:val="Hyperlink"/>
-            <w:lang w:val="en-GB"/>
-          </w:rPr>
-          <w:t xml:space="preserve">Section 3.5</w:t>
-        </w:r>
-      </w:hyperlink>
-      <w:r>
-        <w:rPr>
-          <w:lang w:val="en-GB"/>
-        </w:rPr>
-        <w:t xml:space="preserve">); the trained baselines train on the CPU on every device. The experiment harness has been set up to be able to be run on NVIDIA GPUs and Apple Silicon in a Linux or macOS environment. We welcome reproductions.</w:t>
+        <w:t xml:space="preserve">. Scripts and a README with instructions on how to reproduce the data and figures are included in the supplementary material. Every run records its code version, hardware and library versions. The leak check and the controls and design experiments ran on the CPU of an Apple M1 Max, where runs with the same seed are bit-identical. The later experiments simulated the reservoirs on its GPU, which reproduced 1,262 of 1,296 of the controls experiment’s cells exactly and all but one within two test clips (the record’s summary.md); the trained baselines train on the CPU on every device. The experiment harness has been set up to be able to be run on NVIDIA GPUs and Apple Silicon in a Linux or macOS environment. We welcome reproductions.</w:t>
       </w:r>
     </w:p>
     <w:bookmarkEnd w:id="54"/>
@@ -6846,7 +6825,7 @@
         <w:rPr>
           <w:lang w:val="en-GB"/>
         </w:rPr>
-        <w:t xml:space="preserve">In our experiment, every channel stores its 256 oscillators as a 16 × 16 grid whose row r is driven by mel band r. A lattice geometry changes only which oscillators are neighbours, that is, how the grid’s edges are glued; each of a network’s four channels is a separate copy of the same shape, and the kernel, the parameters and the oscillators are the same under every geometry, so a comparison between geometries varies one thing. The torus is the reference every other geometry is compared against. Wrapped in both directions, it has no edges, so every oscillator has the same neighbourhood and no position in the lattice is special, and each other geometry departs from it in one respect: opening edges, adding a dimension, or laying frequency out differently. Pilot runs before this study also found it at least as accurate as the alternatives, and here no geometry read above it by more than 0.21 points (</w:t>
+        <w:t xml:space="preserve">In our experiment, every channel stores its 256 oscillators as a 16 × 16 grid whose row r is driven by mel band r. A lattice geometry changes only which oscillators are neighbours, that is, how the grid’s edges are glued; each of a network’s four channels is a separate copy of the same shape, and the kernel, the parameters and the oscillators are the same under every geometry, so a comparison between geometries varies one thing. The torus is the reference every other geometry is compared against. Wrapped in both directions, it has no edges, so every oscillator has the same neighbourhood and no position in the lattice is special, and each other geometry departs from it in one respect: opening edges, adding a dimension, or laying frequency out differently. Here no geometry read above it by more than 0.21 points (</w:t>
       </w:r>
       <w:hyperlink w:anchor="sec-4-4">
         <w:r>
@@ -7918,7 +7897,31 @@
         <w:rPr>
           <w:lang w:val="en-GB"/>
         </w:rPr>
-        <w:t xml:space="preserve">Aranson, I. S., &amp; Kramer, L. (2002). The world of the complex ginzburg-landau equation.</w:t>
+        <w:t xml:space="preserve">Aranson, I. S., &amp; Kramer, L. (2002). The world of the complex</w:t>
+      </w:r>
+      <w:r>
+        <w:rPr>
+          <w:lang w:val="en-GB"/>
+        </w:rPr>
+        <w:t xml:space="preserve"> </w:t>
+      </w:r>
+      <w:r>
+        <w:rPr>
+          <w:lang w:val="en-GB"/>
+        </w:rPr>
+        <w:t xml:space="preserve">Ginzburg-Landau</w:t>
+      </w:r>
+      <w:r>
+        <w:rPr>
+          <w:lang w:val="en-GB"/>
+        </w:rPr>
+        <w:t xml:space="preserve"> </w:t>
+      </w:r>
+      <w:r>
+        <w:rPr>
+          <w:lang w:val="en-GB"/>
+        </w:rPr>
+        <w:t xml:space="preserve">equation.</w:t>
       </w:r>
       <w:r>
         <w:rPr>
@@ -8054,7 +8057,25 @@
         <w:rPr>
           <w:lang w:val="en-GB"/>
         </w:rPr>
-        <w:t xml:space="preserve">Becker, S., Vielhaben, J., Ackermann, M., Müller, K.-R., Lapuschkin, S., &amp; Samek, W. (2024). AudioMNIST: Exploring explainable artificial intelligence for audio analysis on a simple benchmark.</w:t>
+        <w:t xml:space="preserve">Becker, S., Vielhaben, J., Ackermann, M., Müller, K.-R., Lapuschkin, S., &amp; Samek, W. (2024).</w:t>
+      </w:r>
+      <w:r>
+        <w:rPr>
+          <w:lang w:val="en-GB"/>
+        </w:rPr>
+        <w:t xml:space="preserve"> </w:t>
+      </w:r>
+      <w:r>
+        <w:rPr>
+          <w:lang w:val="en-GB"/>
+        </w:rPr>
+        <w:t xml:space="preserve">AudioMNIST</w:t>
+      </w:r>
+      <w:r>
+        <w:rPr>
+          <w:lang w:val="en-GB"/>
+        </w:rPr>
+        <w:t xml:space="preserve">: Exploring explainable artificial intelligence for audio analysis on a simple benchmark.</w:t>
       </w:r>
       <w:r>
         <w:rPr>
@@ -8558,7 +8579,31 @@
         <w:rPr>
           <w:lang w:val="en-GB"/>
         </w:rPr>
-        <w:t xml:space="preserve">Doelling, K. B., Arnal, L. H., &amp; Assaneo, M. F. (2023). Adaptive oscillators support bayesian prediction in temporal processing.</w:t>
+        <w:t xml:space="preserve">Doelling, K. B., Arnal, L. H., &amp; Assaneo, M. F. (2023). Adaptive oscillators support</w:t>
+      </w:r>
+      <w:r>
+        <w:rPr>
+          <w:lang w:val="en-GB"/>
+        </w:rPr>
+        <w:t xml:space="preserve"> </w:t>
+      </w:r>
+      <w:r>
+        <w:rPr>
+          <w:lang w:val="en-GB"/>
+        </w:rPr>
+        <w:t xml:space="preserve">Bayesian</w:t>
+      </w:r>
+      <w:r>
+        <w:rPr>
+          <w:lang w:val="en-GB"/>
+        </w:rPr>
+        <w:t xml:space="preserve"> </w:t>
+      </w:r>
+      <w:r>
+        <w:rPr>
+          <w:lang w:val="en-GB"/>
+        </w:rPr>
+        <w:t xml:space="preserve">prediction in temporal processing.</w:t>
       </w:r>
       <w:r>
         <w:rPr>
@@ -8970,7 +9015,55 @@
         <w:rPr>
           <w:lang w:val="en-GB"/>
         </w:rPr>
-        <w:t xml:space="preserve">Johnson, W. B., &amp; Lindenstrauss, J. (1984). Extensions of lipschitz mappings into a hilbert space. In</w:t>
+        <w:t xml:space="preserve">Johnson, W. B., &amp; Lindenstrauss, J. (1984). Extensions of</w:t>
+      </w:r>
+      <w:r>
+        <w:rPr>
+          <w:lang w:val="en-GB"/>
+        </w:rPr>
+        <w:t xml:space="preserve"> </w:t>
+      </w:r>
+      <w:r>
+        <w:rPr>
+          <w:lang w:val="en-GB"/>
+        </w:rPr>
+        <w:t xml:space="preserve">Lipschitz</w:t>
+      </w:r>
+      <w:r>
+        <w:rPr>
+          <w:lang w:val="en-GB"/>
+        </w:rPr>
+        <w:t xml:space="preserve"> </w:t>
+      </w:r>
+      <w:r>
+        <w:rPr>
+          <w:lang w:val="en-GB"/>
+        </w:rPr>
+        <w:t xml:space="preserve">mappings into a</w:t>
+      </w:r>
+      <w:r>
+        <w:rPr>
+          <w:lang w:val="en-GB"/>
+        </w:rPr>
+        <w:t xml:space="preserve"> </w:t>
+      </w:r>
+      <w:r>
+        <w:rPr>
+          <w:lang w:val="en-GB"/>
+        </w:rPr>
+        <w:t xml:space="preserve">Hilbert</w:t>
+      </w:r>
+      <w:r>
+        <w:rPr>
+          <w:lang w:val="en-GB"/>
+        </w:rPr>
+        <w:t xml:space="preserve"> </w:t>
+      </w:r>
+      <w:r>
+        <w:rPr>
+          <w:lang w:val="en-GB"/>
+        </w:rPr>
+        <w:t xml:space="preserve">space. In</w:t>
       </w:r>
       <w:r>
         <w:rPr>
@@ -9352,7 +9445,31 @@
         <w:rPr>
           <w:lang w:val="en-GB"/>
         </w:rPr>
-        <w:t xml:space="preserve">Miyato, T., Löwe, S., Geiger, A., &amp; Welling, M. (2025). Artificial kuramoto oscillatory neurons.</w:t>
+        <w:t xml:space="preserve">Miyato, T., Löwe, S., Geiger, A., &amp; Welling, M. (2025). Artificial</w:t>
+      </w:r>
+      <w:r>
+        <w:rPr>
+          <w:lang w:val="en-GB"/>
+        </w:rPr>
+        <w:t xml:space="preserve"> </w:t>
+      </w:r>
+      <w:r>
+        <w:rPr>
+          <w:lang w:val="en-GB"/>
+        </w:rPr>
+        <w:t xml:space="preserve">Kuramoto</w:t>
+      </w:r>
+      <w:r>
+        <w:rPr>
+          <w:lang w:val="en-GB"/>
+        </w:rPr>
+        <w:t xml:space="preserve"> </w:t>
+      </w:r>
+      <w:r>
+        <w:rPr>
+          <w:lang w:val="en-GB"/>
+        </w:rPr>
+        <w:t xml:space="preserve">oscillatory neurons.</w:t>
       </w:r>
       <w:r>
         <w:rPr>
@@ -9480,7 +9597,31 @@
         <w:rPr>
           <w:lang w:val="en-GB"/>
         </w:rPr>
-        <w:t xml:space="preserve">Opala, A., Ghosh, S., Liew, T. C. H., &amp; Matuszewski, M. (2019). Neuromorphic computing in ginzburg-landau polariton-lattice systems.</w:t>
+        <w:t xml:space="preserve">Opala, A., Ghosh, S., Liew, T. C. H., &amp; Matuszewski, M. (2019). Neuromorphic computing in</w:t>
+      </w:r>
+      <w:r>
+        <w:rPr>
+          <w:lang w:val="en-GB"/>
+        </w:rPr>
+        <w:t xml:space="preserve"> </w:t>
+      </w:r>
+      <w:r>
+        <w:rPr>
+          <w:lang w:val="en-GB"/>
+        </w:rPr>
+        <w:t xml:space="preserve">Ginzburg-Landau</w:t>
+      </w:r>
+      <w:r>
+        <w:rPr>
+          <w:lang w:val="en-GB"/>
+        </w:rPr>
+        <w:t xml:space="preserve"> </w:t>
+      </w:r>
+      <w:r>
+        <w:rPr>
+          <w:lang w:val="en-GB"/>
+        </w:rPr>
+        <w:t xml:space="preserve">polariton-lattice systems.</w:t>
       </w:r>
       <w:r>
         <w:rPr>
@@ -9568,7 +9709,7 @@
         <w:rPr>
           <w:lang w:val="en-GB"/>
         </w:rPr>
-        <w:t xml:space="preserve">. Rosenblum &amp; Kurths, CUP.</w:t>
+        <w:t xml:space="preserve">. Cambridge University Press.</w:t>
       </w:r>
       <w:r>
         <w:rPr>
@@ -10016,7 +10157,49 @@
         <w:rPr>
           <w:lang w:val="en-GB"/>
         </w:rPr>
-        <w:t xml:space="preserve">Strogatz, S. H. (2000). From kuramoto to crawford: Exploring the onset of synchronization in populations of coupled oscillators.</w:t>
+        <w:t xml:space="preserve">Strogatz, S. H. (2000). From</w:t>
+      </w:r>
+      <w:r>
+        <w:rPr>
+          <w:lang w:val="en-GB"/>
+        </w:rPr>
+        <w:t xml:space="preserve"> </w:t>
+      </w:r>
+      <w:r>
+        <w:rPr>
+          <w:lang w:val="en-GB"/>
+        </w:rPr>
+        <w:t xml:space="preserve">Kuramoto</w:t>
+      </w:r>
+      <w:r>
+        <w:rPr>
+          <w:lang w:val="en-GB"/>
+        </w:rPr>
+        <w:t xml:space="preserve"> </w:t>
+      </w:r>
+      <w:r>
+        <w:rPr>
+          <w:lang w:val="en-GB"/>
+        </w:rPr>
+        <w:t xml:space="preserve">to</w:t>
+      </w:r>
+      <w:r>
+        <w:rPr>
+          <w:lang w:val="en-GB"/>
+        </w:rPr>
+        <w:t xml:space="preserve"> </w:t>
+      </w:r>
+      <w:r>
+        <w:rPr>
+          <w:lang w:val="en-GB"/>
+        </w:rPr>
+        <w:t xml:space="preserve">Crawford</w:t>
+      </w:r>
+      <w:r>
+        <w:rPr>
+          <w:lang w:val="en-GB"/>
+        </w:rPr>
+        <w:t xml:space="preserve">: Exploring the onset of synchronization in populations of coupled oscillators.</w:t>
       </w:r>
       <w:r>
         <w:rPr>
@@ -10084,7 +10267,31 @@
         <w:rPr>
           <w:lang w:val="en-GB"/>
         </w:rPr>
-        <w:t xml:space="preserve">Stuart, J. T. (1960). On the non-linear mechanics of wave disturbances in stable and unstable parallel flows part 1. The basic behaviour in plane poiseuille flow.</w:t>
+        <w:t xml:space="preserve">Stuart, J. T. (1960). On the non-linear mechanics of wave disturbances in stable and unstable parallel flows part 1. The basic behaviour in plane</w:t>
+      </w:r>
+      <w:r>
+        <w:rPr>
+          <w:lang w:val="en-GB"/>
+        </w:rPr>
+        <w:t xml:space="preserve"> </w:t>
+      </w:r>
+      <w:r>
+        <w:rPr>
+          <w:lang w:val="en-GB"/>
+        </w:rPr>
+        <w:t xml:space="preserve">Poiseuille</w:t>
+      </w:r>
+      <w:r>
+        <w:rPr>
+          <w:lang w:val="en-GB"/>
+        </w:rPr>
+        <w:t xml:space="preserve"> </w:t>
+      </w:r>
+      <w:r>
+        <w:rPr>
+          <w:lang w:val="en-GB"/>
+        </w:rPr>
+        <w:t xml:space="preserve">flow.</w:t>
       </w:r>
       <w:r>
         <w:rPr>

</xml_diff>

<commit_message>
name the primary cell where the comparisons are set, call appendix d the readout, point the glossary at the supplement's src/README.md, and hyphenate the compound adjectives
</commit_message>
<xml_diff>
--- a/papers/02-untrained-reservoirs/spoken-digit-recognition-without-training.docx
+++ b/papers/02-untrained-reservoirs/spoken-digit-recognition-without-training.docx
@@ -277,7 +277,7 @@
         <w:rPr>
           <w:lang w:val="en-GB"/>
         </w:rPr>
-        <w:t xml:space="preserve">insight into which factors contribute to an oscillator network’s effectiveness on time series</w:t>
+        <w:t xml:space="preserve">insight into which factors contribute to an oscillator network’s effectiveness on time-series</w:t>
       </w:r>
       <w:r>
         <w:rPr>
@@ -1648,7 +1648,7 @@
         <w:rPr>
           <w:lang w:val="en-GB"/>
         </w:rPr>
-        <w:t xml:space="preserve">We perform single digit audio classification over AudioMNIST</w:t>
+        <w:t xml:space="preserve">We perform single-digit audio classification over AudioMNIST</w:t>
       </w:r>
       <w:r>
         <w:rPr>
@@ -1720,7 +1720,7 @@
         <w:rPr>
           <w:lang w:val="en-GB"/>
         </w:rPr>
-        <w:t xml:space="preserve">trained hybrid real and complex-valued convolutional networks on AudioMNIST, though they did so on a random audio sample split so were not speaker disjoint. We also report clean audio for posterity. Additionally, we performed an order task on five different digit pairs where two digits of a pair are spoken one after the other and the arm must say which came first. Statistics of an input read over the whole span cannot tell the orders apart, so the spectrogram-only baseline reads chance, 50%. Every arm hears the same fixed front end, a 16-band log-mel spectrogram at 62.5 frames per second, without training on this task besides the single digit training methodology.</w:t>
+        <w:t xml:space="preserve">trained hybrid real and complex-valued convolutional networks on AudioMNIST, though they did so on a random audio sample split so were not speaker disjoint. We also report clean audio for reference. Additionally, we performed an order task on five different digit pairs where two digits of a pair are spoken one after the other and the arm must say which came first. Statistics of an input read over the whole span cannot tell the orders apart, so the spectrogram-only baseline reads chance, 50%. Every arm hears the same fixed front end, a 16-band log-mel spectrogram at 62.5 frames per second, without training on this task besides the single-digit training methodology.</w:t>
       </w:r>
     </w:p>
     <w:bookmarkEnd w:id="12"/>
@@ -1765,7 +1765,7 @@
         <w:rPr>
           <w:lang w:val="en-GB"/>
         </w:rPr>
-        <w:t xml:space="preserve">draws the read for each kind of arm). Each of its signals (a band energy, the sine or cosine of an oscillator’s phase, a leaky integrator’s state or a trained baseline’s hidden unit) is summarized by its mean, standard deviation and mean absolute change over each of four equal windows of frames 16 to 61, after a 16-frame warm-up (frames 16 to 147 as one window for the order task). So that readout capacity cannot obscure dynamics, every arm is read at the same width, 192 standardized features. That is exactly the spectrogram-only baseline’s own number of features (16 mel bands by 3 statistics by 4 windows), so the input is read without compression, and it is the native width of four of the five trained baselines. Arms with more features, the reservoirs (12,288 to 24,576) and the GRU (216), are projected down to 192 by a random Gaussian matrix</w:t>
+        <w:t xml:space="preserve">draws the readout for each kind of arm). Each of its signals (a band energy, the sine or cosine of an oscillator’s phase, a leaky integrator’s state or a trained baseline’s hidden unit) is summarized by its mean, standard deviation and mean absolute change over each of four equal windows of frames 16 to 61, after a 16-frame warm-up (frames 16 to 147 as one window for the order task). So that readout capacity cannot obscure dynamics, every arm is read at the same width, 192 standardized features. That is exactly the spectrogram-only baseline’s own number of features (16 mel bands by 3 statistics by 4 windows), so the input is read without compression, and it is the native width of four of the five trained baselines. Arms with more features, the reservoirs (12,288 to 24,576) and the GRU (216), are projected down to 192 by a random Gaussian matrix</w:t>
       </w:r>
       <w:r>
         <w:rPr>
@@ -1882,7 +1882,7 @@
         <w:rPr>
           <w:lang w:val="en-GB"/>
         </w:rPr>
-        <w:t xml:space="preserve">The audio drives a reservoir in one of two ways as an A/B comparison: the</w:t>
+        <w:t xml:space="preserve">The audio drives a reservoir in one of two ways: the</w:t>
       </w:r>
       <w:r>
         <w:rPr>
@@ -2024,7 +2024,7 @@
         <w:rPr>
           <w:lang w:val="en-GB"/>
         </w:rPr>
-        <w:t xml:space="preserve">Every task accuracy result reported is the mean over replicates (three seeds; five folds under Protocol B) ± the sample standard deviation, and every comparison between two arms is paired on the same test clips, condition and seed, reported as the mean difference ± its standard deviation over seeds and a 95% interval from 2,000 paired bootstrap resamples of the test clips. The primary cross model comparator is the four-window read, 2,048 training clips and readout width of 192.</w:t>
+        <w:t xml:space="preserve">Every task accuracy result reported is the mean over replicates (three seeds; five folds under Protocol B) ± the sample standard deviation, and every comparison between two arms is paired on the same test clips, condition and seed, reported as the mean difference ± its standard deviation over seeds and a 95% interval from 2,000 paired bootstrap resamples of the test clips. Every comparison is reported at the primary cell, the four-window read at 2,048 training clips and readout width 192, unless it says otherwise.</w:t>
       </w:r>
     </w:p>
     <w:bookmarkEnd w:id="15"/>
@@ -3031,7 +3031,7 @@
         <w:rPr>
           <w:lang w:val="en-GB"/>
         </w:rPr>
-        <w:t xml:space="preserve">Most of every arm’s accuracy on the single digit classification task comes from the front end and the linear readout, and the input’s format matters as much: driven in quadrature, the same networks read near chance (</w:t>
+        <w:t xml:space="preserve">Most of every arm’s accuracy on the single-digit classification task comes from the front end and the linear readout, and the input’s format matters as much: driven in quadrature, the same networks read near chance (</w:t>
       </w:r>
       <w:hyperlink w:anchor="sec-4-6">
         <w:r>
@@ -3799,7 +3799,27 @@
         <w:rPr>
           <w:lang w:val="en-GB"/>
         </w:rPr>
-        <w:t xml:space="preserve">The terms as this paper uses them. The code and the run record keep their own labels; src/README.md maps each term to its label.</w:t>
+        <w:t xml:space="preserve">The terms as this paper uses them. The code and the run record keep their own labels;</w:t>
+      </w:r>
+      <w:r>
+        <w:rPr>
+          <w:lang w:val="en-GB"/>
+        </w:rPr>
+        <w:t xml:space="preserve"> </w:t>
+      </w:r>
+      <w:r>
+        <w:rPr>
+          <w:i/>
+          <w:iCs/>
+          <w:lang w:val="en-GB"/>
+        </w:rPr>
+        <w:t xml:space="preserve">src/README.md</w:t>
+      </w:r>
+      <w:r>
+        <w:rPr>
+          <w:lang w:val="en-GB"/>
+        </w:rPr>
+        <w:t xml:space="preserve">, in the supplementary material, maps each term to its label.</w:t>
       </w:r>
     </w:p>
     <w:bookmarkStart w:id="58" w:name="sec-A-1"/>
@@ -7474,7 +7494,7 @@
         <w:rPr>
           <w:lang w:val="en-GB"/>
         </w:rPr>
-        <w:t xml:space="preserve">D The read</w:t>
+        <w:t xml:space="preserve">D The readout</w:t>
       </w:r>
     </w:p>
     <w:bookmarkStart w:id="77" w:name="sec-D-1"/>
@@ -7486,7 +7506,7 @@
         <w:rPr>
           <w:lang w:val="en-GB"/>
         </w:rPr>
-        <w:t xml:space="preserve">D.1 The read for each arm</w:t>
+        <w:t xml:space="preserve">D.1 The readout for each arm</w:t>
       </w:r>
     </w:p>
     <w:bookmarkStart w:id="76" w:name="fig-a4-the-read"/>
@@ -7499,7 +7519,7 @@
           <wp:inline>
             <wp:extent cx="5334000" cy="2446555"/>
             <wp:effectExtent b="0" l="0" r="0" t="0"/>
-            <wp:docPr descr="The read for each kind of arm: the same three statistics over the same four windows, classified by a ridge readout fitted to each arm. The spectrogram-only baseline’s 192 features are read as they are; a reservoir’s 12,288 to 24,576 are standardized and projected to 192 by a fixed random matrix; a trained baseline’s 192 (the GRU’s 216, projected) are read after the network is trained end to end through a learned linear head." title="" id="74" name="Picture"/>
+            <wp:docPr descr="The readout for each kind of arm: the same three statistics over the same four windows, classified by a ridge readout fitted to each arm. The spectrogram-only baseline’s 192 features are read as they are; a reservoir’s 12,288 to 24,576 are standardized and projected to 192 by a fixed random matrix; a trained baseline’s 192 (the GRU’s 216, projected) are read after the network is trained end to end through a learned linear head." title="" id="74" name="Picture"/>
             <a:graphic>
               <a:graphicData uri="http://schemas.openxmlformats.org/drawingml/2006/picture">
                 <pic:pic>
@@ -7545,7 +7565,7 @@
         <w:rPr>
           <w:lang w:val="en-GB"/>
         </w:rPr>
-        <w:t xml:space="preserve">Figure 10. The read for each kind of arm: the same three statistics over the same four windows, classified by a ridge readout fitted to each arm. The spectrogram-only baseline’s 192 features are read as they are; a reservoir’s 12,288 to 24,576 are standardized and projected to 192 by a fixed random matrix; a trained baseline’s 192 (the GRU’s 216, projected) are read after the network is trained end to end through a learned linear head.</w:t>
+        <w:t xml:space="preserve">Figure 10. The readout for each kind of arm: the same three statistics over the same four windows, classified by a ridge readout fitted to each arm. The spectrogram-only baseline’s 192 features are read as they are; a reservoir’s 12,288 to 24,576 are standardized and projected to 192 by a fixed random matrix; a trained baseline’s 192 (the GRU’s 216, projected) are read after the network is trained end to end through a learned linear head.</w:t>
       </w:r>
     </w:p>
     <w:bookmarkEnd w:id="76"/>

</xml_diff>

<commit_message>
name paper 02's figures by their number and place in the paper, and drop the stale tmlr build
</commit_message>
<xml_diff>
--- a/papers/02-untrained-reservoirs/spoken-digit-recognition-without-training.docx
+++ b/papers/02-untrained-reservoirs/spoken-digit-recognition-without-training.docx
@@ -2057,7 +2057,7 @@
       <w:pPr>
         <w:pStyle w:val="FirstParagraph"/>
       </w:pPr>
-      <w:hyperlink w:anchor="fig-c3-recognition-arms">
+      <w:hyperlink w:anchor="fig-fig01-sec4-1-recognition-arms">
         <w:r>
           <w:rPr>
             <w:rStyle w:val="Hyperlink"/>
@@ -2133,7 +2133,7 @@
         <w:t xml:space="preserve">(clean, 18,000 training clips), the baseline read 96.0 ± 1.7%, the network 91.9 ± 3.1% (96.9 ± 1.3% at width 4,096) and the trained baselines 97.0% to 98.4%, against 95.8% reported for AlexNet on spectrograms.</w:t>
       </w:r>
     </w:p>
-    <w:bookmarkStart w:id="20" w:name="fig-c3-recognition-arms"/>
+    <w:bookmarkStart w:id="20" w:name="fig-fig01-sec4-1-recognition-arms"/>
     <w:p>
       <w:pPr>
         <w:pStyle w:val="CaptionedFigure"/>
@@ -2148,7 +2148,7 @@
               <a:graphicData uri="http://schemas.openxmlformats.org/drawingml/2006/picture">
                 <pic:pic>
                   <pic:nvPicPr>
-                    <pic:cNvPr descr="resources/figures/c3-recognition-arms.png" id="19" name="Picture"/>
+                    <pic:cNvPr descr="resources/figures/fig01-sec4-1-recognition-arms.png" id="19" name="Picture"/>
                     <pic:cNvPicPr>
                       <a:picLocks noChangeArrowheads="1" noChangeAspect="1"/>
                     </pic:cNvPicPr>
@@ -2210,7 +2210,7 @@
       <w:pPr>
         <w:pStyle w:val="FirstParagraph"/>
       </w:pPr>
-      <w:hyperlink w:anchor="fig-c8-order-arms">
+      <w:hyperlink w:anchor="fig-fig02-sec4-2-order-arms">
         <w:r>
           <w:rPr>
             <w:rStyle w:val="Hyperlink"/>
@@ -2232,7 +2232,7 @@
         <w:t xml:space="preserve">shows every arm on the two digit ordered classification task, averaged over the five digit pairs; the supplementary material gives the table. The spectrogram-only baseline read 49.8% to 50.6% on the order task in every condition. The Kuramoto network read 97.7%, 96.2% and 95.5% at gain 1 (clean, 0 dB, −5 dB), 45.4 to 47.9 points above it; uncoupled, it read 2.2 to 8.5 points lower at gain 1 and 10.4 to 18.7 points lower at gain 2. Both leaky-integrator banks read 98.7% to 99.9%, 2.2 to 7.5 points above the network. The transformer and GRU read 99.0% to 99.9%, the S4D 96.9% to 99.1% and the TCN 91.1% to 99.9%. The CNN read 92.2% on clean audio and chance with noise: its two convolutions see 9 frames (144 ms), less than a digit, so with no memory beyond that window it can tell the orders apart only where one digit meets the other, a cue the noise masks.</w:t>
       </w:r>
     </w:p>
-    <w:bookmarkStart w:id="25" w:name="fig-c8-order-arms"/>
+    <w:bookmarkStart w:id="25" w:name="fig-fig02-sec4-2-order-arms"/>
     <w:p>
       <w:pPr>
         <w:pStyle w:val="CaptionedFigure"/>
@@ -2247,7 +2247,7 @@
               <a:graphicData uri="http://schemas.openxmlformats.org/drawingml/2006/picture">
                 <pic:pic>
                   <pic:nvPicPr>
-                    <pic:cNvPr descr="resources/figures/c8-order-arms.png" id="24" name="Picture"/>
+                    <pic:cNvPr descr="resources/figures/fig02-sec4-2-order-arms.png" id="24" name="Picture"/>
                     <pic:cNvPicPr>
                       <a:picLocks noChangeArrowheads="1" noChangeAspect="1"/>
                     </pic:cNvPicPr>
@@ -2315,7 +2315,7 @@
         </w:rPr>
         <w:t xml:space="preserve">The design experiment crossed six coupling functions, six lattice geometries, three kinds of natural frequencies, two restoring strengths and two coupling ceilings (the Stuart–Landau functions on the torus only), 312 configurations at 0 and −5 dB, gains 1 and 2 and three seeds, each level paired with its reference over every configuration matching it in the other factors (</w:t>
       </w:r>
-      <w:hyperlink w:anchor="fig-c4-coupling-functions">
+      <w:hyperlink w:anchor="fig-fig03-sec4-3-coupling-functions">
         <w:r>
           <w:rPr>
             <w:rStyle w:val="Hyperlink"/>
@@ -2357,7 +2357,7 @@
         <w:t xml:space="preserve">network, whose oscillators have a free amplitude, read 2.1 to 3.8 points above its Kuramoto match, the largest difference in the experiment, and at the reference configuration it read above the whole-clip baseline in all four noisy conditions, by 1.14 to 2.31 points with every interval above zero; with its amplitude fixed it read within 0.3 points of Kuramoto. The other phase coupling functions differed from Kuramoto by at most 0.46 points.</w:t>
       </w:r>
     </w:p>
-    <w:bookmarkStart w:id="30" w:name="fig-c4-coupling-functions"/>
+    <w:bookmarkStart w:id="30" w:name="fig-fig03-sec4-3-coupling-functions"/>
     <w:p>
       <w:pPr>
         <w:pStyle w:val="CaptionedFigure"/>
@@ -2372,7 +2372,7 @@
               <a:graphicData uri="http://schemas.openxmlformats.org/drawingml/2006/picture">
                 <pic:pic>
                   <pic:nvPicPr>
-                    <pic:cNvPr descr="resources/figures/c4-coupling-functions.png" id="29" name="Picture"/>
+                    <pic:cNvPr descr="resources/figures/fig03-sec4-3-coupling-functions.png" id="29" name="Picture"/>
                     <pic:cNvPicPr>
                       <a:picLocks noChangeArrowheads="1" noChangeAspect="1"/>
                     </pic:cNvPicPr>
@@ -2466,7 +2466,7 @@
         </w:rPr>
         <w:t xml:space="preserve">in the design experiment read within 0.65 points of the torus, the sphere and sheet lowest (</w:t>
       </w:r>
-      <w:hyperlink w:anchor="fig-c4-lattice-geometries">
+      <w:hyperlink w:anchor="fig-fig04-sec4-4-lattice-geometries">
         <w:r>
           <w:rPr>
             <w:rStyle w:val="Hyperlink"/>
@@ -2522,7 +2522,7 @@
         <w:t xml:space="preserve">, the coil with coupling three times as strong from base to apex as back and growing with the coil’s curvature toward the apex, read 0.41 to 0.97 points below the torus. Part of that gap is the cochlea’s weaker coupling: capping its curvature weights at the apex halves its average coupling, and a control at the coil’s average coupling read 0.28 to 0.71 points above the cochlea, yet 0.40 to 0.47 points below the coil at gain 1 and within 0.12 points of it at gain 2.</w:t>
       </w:r>
     </w:p>
-    <w:bookmarkStart w:id="35" w:name="fig-c4-lattice-geometries"/>
+    <w:bookmarkStart w:id="35" w:name="fig-fig04-sec4-4-lattice-geometries"/>
     <w:p>
       <w:pPr>
         <w:pStyle w:val="CaptionedFigure"/>
@@ -2537,7 +2537,7 @@
               <a:graphicData uri="http://schemas.openxmlformats.org/drawingml/2006/picture">
                 <pic:pic>
                   <pic:nvPicPr>
-                    <pic:cNvPr descr="resources/figures/c4-lattice-geometries.png" id="34" name="Picture"/>
+                    <pic:cNvPr descr="resources/figures/fig04-sec4-4-lattice-geometries.png" id="34" name="Picture"/>
                     <pic:cNvPicPr>
                       <a:picLocks noChangeArrowheads="1" noChangeAspect="1"/>
                     </pic:cNvPicPr>
@@ -2670,7 +2670,7 @@
         </w:rPr>
         <w:t xml:space="preserve">frequencies set every rate to 1. Tonotopic frequencies read 0.38 to 1.16 percentage points below random ones, and identical ones within 0.1 (</w:t>
       </w:r>
-      <w:hyperlink w:anchor="fig-c4-natural-frequencies">
+      <w:hyperlink w:anchor="fig-fig05-sec4-4-natural-frequencies">
         <w:r>
           <w:rPr>
             <w:rStyle w:val="Hyperlink"/>
@@ -2686,7 +2686,7 @@
         <w:t xml:space="preserve">).</w:t>
       </w:r>
     </w:p>
-    <w:bookmarkStart w:id="39" w:name="fig-c4-natural-frequencies"/>
+    <w:bookmarkStart w:id="39" w:name="fig-fig05-sec4-4-natural-frequencies"/>
     <w:p>
       <w:pPr>
         <w:pStyle w:val="CaptionedFigure"/>
@@ -2701,7 +2701,7 @@
               <a:graphicData uri="http://schemas.openxmlformats.org/drawingml/2006/picture">
                 <pic:pic>
                   <pic:nvPicPr>
-                    <pic:cNvPr descr="resources/figures/c4-natural-frequencies.png" id="38" name="Picture"/>
+                    <pic:cNvPr descr="resources/figures/fig05-sec4-4-natural-frequencies.png" id="38" name="Picture"/>
                     <pic:cNvPicPr>
                       <a:picLocks noChangeArrowheads="1" noChangeAspect="1"/>
                     </pic:cNvPicPr>
@@ -2769,7 +2769,7 @@
         </w:rPr>
         <w:t xml:space="preserve">A restoring strength (the pull toward phase 0) of 0.1 read 0.13 to 0.23 points below 0.3, and a coupling ceiling of 0.5 read 0.39 to 0.68 points below 1. A sweep beyond these levels, for every coupling function at the reference configuration, found restoring strengths of 0.5 to 1.0 moving the phase-oscillator networks by −1.2 to +2.1 points and lowering the Stuart–Landau network in every condition, by 0.4 to 2.8 points, and ceilings of 1.5 and 2 moving every coupling function by −2.4 to +1.7 points. Gain separates the Stuart–Landau network from the rest (</w:t>
       </w:r>
-      <w:hyperlink w:anchor="fig-c6-restoring-ceiling-gain">
+      <w:hyperlink w:anchor="fig-fig06-sec4-5-restoring-ceiling-gain">
         <w:r>
           <w:rPr>
             <w:rStyle w:val="Hyperlink"/>
@@ -2785,7 +2785,7 @@
         <w:t xml:space="preserve">): from gain 1 to gain 8 it lost 4.3 points at 0 dB and 2.8 at −5 dB, while every phase-oscillator network lost 15 to 19 points and the Stuart–Landau network with its amplitude fixed 25 to 28; beyond gain 8 it also gave way, losing 8.4 points by gain 10 and 20.8 by gain 12 at 0 dB. Below gain 1 the order reverses: at gains 0.25 and 0.5 the phase-oscillator networks and the fixed-amplitude network read 0.3 to 2.5 points above gain 1 and the Stuart–Landau network 0.7 to 1.7 points below it. At its better low gain every phase-oscillator network read above its input at 0 dB, by 0.7 to 1.6 points, and the second-harmonic network at −5 dB too, by 1.4, which brings the best of them within 0.8 points of the Stuart–Landau network at gain 1 at 0 dB and level with it at −5 dB.</w:t>
       </w:r>
     </w:p>
-    <w:bookmarkStart w:id="44" w:name="fig-c6-restoring-ceiling-gain"/>
+    <w:bookmarkStart w:id="44" w:name="fig-fig06-sec4-5-restoring-ceiling-gain"/>
     <w:p>
       <w:pPr>
         <w:pStyle w:val="CaptionedFigure"/>
@@ -2800,7 +2800,7 @@
               <a:graphicData uri="http://schemas.openxmlformats.org/drawingml/2006/picture">
                 <pic:pic>
                   <pic:nvPicPr>
-                    <pic:cNvPr descr="resources/figures/c6-restoring-ceiling-gain.png" id="43" name="Picture"/>
+                    <pic:cNvPr descr="resources/figures/fig06-sec4-5-restoring-ceiling-gain.png" id="43" name="Picture"/>
                     <pic:cNvPicPr>
                       <a:picLocks noChangeArrowheads="1" noChangeAspect="1"/>
                     </pic:cNvPicPr>
@@ -2892,7 +2892,7 @@
         </w:rPr>
         <w:t xml:space="preserve">Widening the readout to 1,024 and 4,096 features raised nearly every arm with more than 192 features to read, the Kuramoto network by up to 3.8 points at gain 1 (6.3 at gain 2) and the leaky-integrator banks by up to 6.2, and left the 192-wide arms unchanged (</w:t>
       </w:r>
-      <w:hyperlink w:anchor="fig-c9-readout-width">
+      <w:hyperlink w:anchor="fig-fig07-sec4-7-readout-width">
         <w:r>
           <w:rPr>
             <w:rStyle w:val="Hyperlink"/>
@@ -2935,7 +2935,7 @@
         <w:t xml:space="preserve">shows the reader structure). From 2,048 to 24,000 training clips, at width 192 and with noise, the spectrogram-only baseline gained 3.5 to 4.1 points, the Kuramoto network 2.0 and the trained baselines 7.1 to 12.4, since they learn through their networks as well as their readout. At width 4,096 the Kuramoto network read above the whole-clip spectrogram-only baseline at every training size, and with 2,048 clips at 0 dB above the S4D, CNN and transformer (81.4% against 79.2% to 80.8%), though through a readout with more weights than theirs; with 8,192 or 24,000 clips every trained baseline read above every reservoir at every width with noise. Read through the seeded projection instead of the fixed one, the controls experiment’s reservoirs moved by −1.29 to +1.22 points (median −0.06), and every paired comparison between the controls arms kept its sign.</w:t>
       </w:r>
     </w:p>
-    <w:bookmarkStart w:id="50" w:name="fig-c9-readout-width"/>
+    <w:bookmarkStart w:id="50" w:name="fig-fig07-sec4-7-readout-width"/>
     <w:p>
       <w:pPr>
         <w:pStyle w:val="CaptionedFigure"/>
@@ -2950,7 +2950,7 @@
               <a:graphicData uri="http://schemas.openxmlformats.org/drawingml/2006/picture">
                 <pic:pic>
                   <pic:nvPicPr>
-                    <pic:cNvPr descr="resources/figures/c9-readout-width.png" id="49" name="Picture"/>
+                    <pic:cNvPr descr="resources/figures/fig07-sec4-7-readout-width.png" id="49" name="Picture"/>
                     <pic:cNvPicPr>
                       <a:picLocks noChangeArrowheads="1" noChangeAspect="1"/>
                     </pic:cNvPicPr>
@@ -3048,7 +3048,7 @@
         </w:rPr>
         <w:t xml:space="preserve">). Read directly on the spectrogram, the readout reaches 93.6%, 78.0% and 71.6%, and at the common width no untrained reservoir adds more than 2.3 points to that, the most being the Stuart–Landau network’s. At gains 1 and 2 the untrained Kuramoto network does not read above its own input. What it adds is memory: read only after its warm-up, it recovers most of what the input loses without its first 16 frames, which hold the onset, and it carries the order of two digits that an order-free read of the input cannot see. A leaky-integrator bank of the same size does both, better on order and on clean audio though about 4 points worse with noise, and both remember by the same means, integration. A leaky integrator keeps a running average of its band’s energy; a Kuramoto oscillator’s phase advances at its natural frequency plus its drive, so, apart from the restoring pull and the coupling, its phase is the running sum of its band’s energy wrapped around the circle. Because an integrator’s state at each moment depends on what came before it, statistics of that state over the clip differ with the order of its inputs, where the same statistics of the input do not. Oscillation therefore adds no memory the bank lacks; the phase is an integrator whose sum wraps. An analysis of variance per band and time window shows it (</w:t>
       </w:r>
-      <w:hyperlink w:anchor="fig-c7-anova-f">
+      <w:hyperlink w:anchor="fig-fig11-appD2-class-information">
         <w:r>
           <w:rPr>
             <w:rStyle w:val="Hyperlink"/>
@@ -5890,7 +5890,7 @@
         </w:rPr>
         <w:t xml:space="preserve"> </w:t>
       </w:r>
-      <w:hyperlink w:anchor="fig-a3-coupling-functions">
+      <w:hyperlink w:anchor="fig-fig08-appB-coupling-functions">
         <w:r>
           <w:rPr>
             <w:rStyle w:val="Hyperlink"/>
@@ -6764,7 +6764,7 @@
         </w:tc>
       </w:tr>
     </w:tbl>
-    <w:bookmarkStart w:id="66" w:name="fig-a3-coupling-functions"/>
+    <w:bookmarkStart w:id="66" w:name="fig-fig08-appB-coupling-functions"/>
     <w:p>
       <w:pPr>
         <w:pStyle w:val="CaptionedFigure"/>
@@ -6779,7 +6779,7 @@
               <a:graphicData uri="http://schemas.openxmlformats.org/drawingml/2006/picture">
                 <pic:pic>
                   <pic:nvPicPr>
-                    <pic:cNvPr descr="resources/figures/a3-coupling-functions.png" id="65" name="Picture"/>
+                    <pic:cNvPr descr="resources/figures/fig08-appB-coupling-functions.png" id="65" name="Picture"/>
                     <pic:cNvPicPr>
                       <a:picLocks noChangeArrowheads="1" noChangeAspect="1"/>
                     </pic:cNvPicPr>
@@ -7424,7 +7424,7 @@
         <w:t xml:space="preserve">.</w:t>
       </w:r>
     </w:p>
-    <w:bookmarkStart w:id="71" w:name="fig-a2-lattice-geometries"/>
+    <w:bookmarkStart w:id="71" w:name="fig-fig09-appC-lattice-geometries"/>
     <w:p>
       <w:pPr>
         <w:pStyle w:val="CaptionedFigure"/>
@@ -7439,7 +7439,7 @@
               <a:graphicData uri="http://schemas.openxmlformats.org/drawingml/2006/picture">
                 <pic:pic>
                   <pic:nvPicPr>
-                    <pic:cNvPr descr="resources/figures/a2-lattice-geometries.png" id="70" name="Picture"/>
+                    <pic:cNvPr descr="resources/figures/fig09-appC-lattice-geometries.png" id="70" name="Picture"/>
                     <pic:cNvPicPr>
                       <a:picLocks noChangeArrowheads="1" noChangeAspect="1"/>
                     </pic:cNvPicPr>
@@ -7509,7 +7509,7 @@
         <w:t xml:space="preserve">D.1 The readout for each arm</w:t>
       </w:r>
     </w:p>
-    <w:bookmarkStart w:id="76" w:name="fig-a4-the-read"/>
+    <w:bookmarkStart w:id="76" w:name="fig-fig10-appD1-readout"/>
     <w:p>
       <w:pPr>
         <w:pStyle w:val="CaptionedFigure"/>
@@ -7524,7 +7524,7 @@
               <a:graphicData uri="http://schemas.openxmlformats.org/drawingml/2006/picture">
                 <pic:pic>
                   <pic:nvPicPr>
-                    <pic:cNvPr descr="resources/figures/a4-the-read.png" id="75" name="Picture"/>
+                    <pic:cNvPr descr="resources/figures/fig10-appD1-readout.png" id="75" name="Picture"/>
                     <pic:cNvPicPr>
                       <a:picLocks noChangeArrowheads="1" noChangeAspect="1"/>
                     </pic:cNvPicPr>
@@ -7636,7 +7636,7 @@
         </w:rPr>
         <w:t xml:space="preserve">The input carries its information in a burst at the onset: its F peaks at 425 in band 4 in the fourth window, and averages 119 over windows 7 to 16. Every reservoir peaks later and lower (the Kuramoto network at 307, the Stuart–Landau network at 284 and the state-matched leaky-integrator bank at 378, in the fifth or sixth window) and holds more information afterwards, averaging 151 to 158 over windows 7 to 16, and 165 to 172 in the lower eight bands, where the input averages 110 (</w:t>
       </w:r>
-      <w:hyperlink w:anchor="fig-c7-anova-f">
+      <w:hyperlink w:anchor="fig-fig11-appD2-class-information">
         <w:r>
           <w:rPr>
             <w:rStyle w:val="Hyperlink"/>
@@ -7652,7 +7652,7 @@
         <w:t xml:space="preserve">).</w:t>
       </w:r>
     </w:p>
-    <w:bookmarkStart w:id="81" w:name="fig-c7-anova-f"/>
+    <w:bookmarkStart w:id="81" w:name="fig-fig11-appD2-class-information"/>
     <w:p>
       <w:pPr>
         <w:pStyle w:val="CaptionedFigure"/>
@@ -7667,7 +7667,7 @@
               <a:graphicData uri="http://schemas.openxmlformats.org/drawingml/2006/picture">
                 <pic:pic>
                   <pic:nvPicPr>
-                    <pic:cNvPr descr="resources/figures/c7-anova-f.png" id="80" name="Picture"/>
+                    <pic:cNvPr descr="resources/figures/fig11-appD2-class-information.png" id="80" name="Picture"/>
                     <pic:cNvPicPr>
                       <a:picLocks noChangeArrowheads="1" noChangeAspect="1"/>
                     </pic:cNvPicPr>

</xml_diff>